<commit_message>
Move Forward memo: add What Breaks, the four verbs, the one-line version
- What Breaks demand box (pain before solution): turnover/ownership/funding-
  without-readiness/no-continuity/plans-without-implementation, closing with
  "PublicLogic exists because these problems are common, expensive, and
  preventable."
- Four verbs on the progression: Understand · Navigate · Diagnose · Deliver.
- "What we're becoming" infrastructure framing + the website subheading:
  "Help people understand the path. Help projects move through the path.
  Leave the path easier for the next person."
Refresh the v1 stack zip with the updated cover.

https://claude.ai/code/session_01NNVRfcBeiW4jRftzrwemzW
</commit_message>
<xml_diff>
--- a/docs/business/final_deck/PublicLogic - Move Forward (v1 Business Stack).docx
+++ b/docs/business/final_deck/PublicLogic - Move Forward (v1 Business Stack).docx
@@ -183,6 +183,251 @@
           <w:color w:val="0F4C3A"/>
           <w:sz w:val="20"/>
         </w:rPr>
+        <w:t>WHAT BREAKS  (why this is needed)</w:t>
+      </w:r>
+    </w:p>
+    <w:tbl>
+      <w:tblPr>
+        <w:tblW w:type="auto" w:w="0"/>
+        <w:jc w:val="center"/>
+        <w:tblLayout w:type="fixed"/>
+        <w:tblLook w:firstColumn="1" w:firstRow="1" w:lastColumn="0" w:lastRow="0" w:noHBand="0" w:noVBand="1" w:val="04A0"/>
+      </w:tblPr>
+      <w:tblGrid>
+        <w:gridCol w:w="4968"/>
+        <w:gridCol w:w="4968"/>
+      </w:tblGrid>
+      <w:tr>
+        <w:tc>
+          <w:tcPr>
+            <w:tcW w:type="dxa" w:w="3168"/>
+            <w:shd w:val="clear" w:fill="1A1D20"/>
+          </w:tcPr>
+          <w:p>
+            <w:r>
+              <w:rPr>
+                <w:rFonts w:ascii="Calibri" w:hAnsi="Calibri"/>
+                <w:b/>
+                <w:color w:val="FFFFFF"/>
+                <w:sz w:val="19"/>
+              </w:rPr>
+              <w:t>What breaks</w:t>
+            </w:r>
+          </w:p>
+        </w:tc>
+        <w:tc>
+          <w:tcPr>
+            <w:tcW w:type="dxa" w:w="6768"/>
+            <w:shd w:val="clear" w:fill="1A1D20"/>
+          </w:tcPr>
+          <w:p>
+            <w:r>
+              <w:rPr>
+                <w:rFonts w:ascii="Calibri" w:hAnsi="Calibri"/>
+                <w:b/>
+                <w:color w:val="FFFFFF"/>
+                <w:sz w:val="19"/>
+              </w:rPr>
+              <w:t>What happens</w:t>
+            </w:r>
+          </w:p>
+        </w:tc>
+      </w:tr>
+      <w:tr>
+        <w:tc>
+          <w:tcPr>
+            <w:tcW w:type="dxa" w:w="3168"/>
+          </w:tcPr>
+          <w:p>
+            <w:r>
+              <w:rPr>
+                <w:rFonts w:ascii="Calibri" w:hAnsi="Calibri"/>
+                <w:b/>
+                <w:color w:val="1A1D20"/>
+                <w:sz w:val="20"/>
+              </w:rPr>
+              <w:t>Turnover</w:t>
+            </w:r>
+          </w:p>
+        </w:tc>
+        <w:tc>
+          <w:tcPr>
+            <w:tcW w:type="dxa" w:w="6768"/>
+          </w:tcPr>
+          <w:p>
+            <w:r>
+              <w:rPr>
+                <w:rFonts w:ascii="Calibri" w:hAnsi="Calibri"/>
+                <w:color w:val="1A1D20"/>
+                <w:sz w:val="20"/>
+              </w:rPr>
+              <w:t>Knowledge leaves with the person.</w:t>
+            </w:r>
+          </w:p>
+        </w:tc>
+      </w:tr>
+      <w:tr>
+        <w:tc>
+          <w:tcPr>
+            <w:tcW w:type="dxa" w:w="3168"/>
+          </w:tcPr>
+          <w:p>
+            <w:r>
+              <w:rPr>
+                <w:rFonts w:ascii="Calibri" w:hAnsi="Calibri"/>
+                <w:b/>
+                <w:color w:val="1A1D20"/>
+                <w:sz w:val="20"/>
+              </w:rPr>
+              <w:t>Unclear ownership</w:t>
+            </w:r>
+          </w:p>
+        </w:tc>
+        <w:tc>
+          <w:tcPr>
+            <w:tcW w:type="dxa" w:w="6768"/>
+          </w:tcPr>
+          <w:p>
+            <w:r>
+              <w:rPr>
+                <w:rFonts w:ascii="Calibri" w:hAnsi="Calibri"/>
+                <w:color w:val="1A1D20"/>
+                <w:sz w:val="20"/>
+              </w:rPr>
+              <w:t>Projects stall — no one holds the next step.</w:t>
+            </w:r>
+          </w:p>
+        </w:tc>
+      </w:tr>
+      <w:tr>
+        <w:tc>
+          <w:tcPr>
+            <w:tcW w:type="dxa" w:w="3168"/>
+          </w:tcPr>
+          <w:p>
+            <w:r>
+              <w:rPr>
+                <w:rFonts w:ascii="Calibri" w:hAnsi="Calibri"/>
+                <w:b/>
+                <w:color w:val="1A1D20"/>
+                <w:sz w:val="20"/>
+              </w:rPr>
+              <w:t>Funding without readiness</w:t>
+            </w:r>
+          </w:p>
+        </w:tc>
+        <w:tc>
+          <w:tcPr>
+            <w:tcW w:type="dxa" w:w="6768"/>
+          </w:tcPr>
+          <w:p>
+            <w:r>
+              <w:rPr>
+                <w:rFonts w:ascii="Calibri" w:hAnsi="Calibri"/>
+                <w:color w:val="1A1D20"/>
+                <w:sz w:val="20"/>
+              </w:rPr>
+              <w:t>Momentum collapses; the window closes.</w:t>
+            </w:r>
+          </w:p>
+        </w:tc>
+      </w:tr>
+      <w:tr>
+        <w:tc>
+          <w:tcPr>
+            <w:tcW w:type="dxa" w:w="3168"/>
+          </w:tcPr>
+          <w:p>
+            <w:r>
+              <w:rPr>
+                <w:rFonts w:ascii="Calibri" w:hAnsi="Calibri"/>
+                <w:b/>
+                <w:color w:val="1A1D20"/>
+                <w:sz w:val="20"/>
+              </w:rPr>
+              <w:t>No continuity system</w:t>
+            </w:r>
+          </w:p>
+        </w:tc>
+        <w:tc>
+          <w:tcPr>
+            <w:tcW w:type="dxa" w:w="6768"/>
+          </w:tcPr>
+          <w:p>
+            <w:r>
+              <w:rPr>
+                <w:rFonts w:ascii="Calibri" w:hAnsi="Calibri"/>
+                <w:color w:val="1A1D20"/>
+                <w:sz w:val="20"/>
+              </w:rPr>
+              <w:t>Work restarts from zero.</w:t>
+            </w:r>
+          </w:p>
+        </w:tc>
+      </w:tr>
+      <w:tr>
+        <w:tc>
+          <w:tcPr>
+            <w:tcW w:type="dxa" w:w="3168"/>
+          </w:tcPr>
+          <w:p>
+            <w:r>
+              <w:rPr>
+                <w:rFonts w:ascii="Calibri" w:hAnsi="Calibri"/>
+                <w:b/>
+                <w:color w:val="1A1D20"/>
+                <w:sz w:val="20"/>
+              </w:rPr>
+              <w:t>Plans without implementation</w:t>
+            </w:r>
+          </w:p>
+        </w:tc>
+        <w:tc>
+          <w:tcPr>
+            <w:tcW w:type="dxa" w:w="6768"/>
+          </w:tcPr>
+          <w:p>
+            <w:r>
+              <w:rPr>
+                <w:rFonts w:ascii="Calibri" w:hAnsi="Calibri"/>
+                <w:color w:val="1A1D20"/>
+                <w:sz w:val="20"/>
+              </w:rPr>
+              <w:t>Reports sit on shelves.</w:t>
+            </w:r>
+          </w:p>
+        </w:tc>
+      </w:tr>
+    </w:tbl>
+    <w:p>
+      <w:pPr>
+        <w:spacing w:before="60" w:after="120" w:line="252" w:lineRule="auto"/>
+        <w:jc w:val="left"/>
+      </w:pPr>
+      <w:r>
+        <w:rPr>
+          <w:rFonts w:ascii="Calibri" w:hAnsi="Calibri"/>
+          <w:b/>
+          <w:i/>
+          <w:color w:val="0F4C3A"/>
+          <w:sz w:val="22"/>
+        </w:rPr>
+        <w:t>PublicLogic exists because these problems are common, expensive, and preventable.</w:t>
+      </w:r>
+    </w:p>
+    <w:p>
+      <w:pPr>
+        <w:spacing w:before="160" w:after="40" w:line="252" w:lineRule="auto"/>
+        <w:jc w:val="left"/>
+      </w:pPr>
+      <w:r>
+        <w:rPr>
+          <w:rFonts w:ascii="Calibri" w:hAnsi="Calibri"/>
+          <w:b/>
+          <w:i w:val="0"/>
+          <w:color w:val="0F4C3A"/>
+          <w:sz w:val="20"/>
+        </w:rPr>
         <w:t>THE PROGRESSION  (this is how people actually buy)</w:t>
       </w:r>
     </w:p>
@@ -211,7 +456,7 @@
                 <w:color w:val="FFFFFF"/>
                 <w:sz w:val="19"/>
               </w:rPr>
-              <w:t>Layer</w:t>
+              <w:t>Layer · Verb</w:t>
             </w:r>
           </w:p>
         </w:tc>
@@ -247,7 +492,7 @@
                 <w:color w:val="FFFFFF"/>
                 <w:sz w:val="20"/>
               </w:rPr>
-              <w:t>LogicCommons</w:t>
+              <w:t>LogicCommons · Understand</w:t>
             </w:r>
           </w:p>
         </w:tc>
@@ -281,7 +526,7 @@
                 <w:color w:val="FFFFFF"/>
                 <w:sz w:val="20"/>
               </w:rPr>
-              <w:t>Permit &amp; Bridge</w:t>
+              <w:t>Permit &amp; Bridge · Navigate</w:t>
             </w:r>
           </w:p>
         </w:tc>
@@ -315,7 +560,7 @@
                 <w:color w:val="FFFFFF"/>
                 <w:sz w:val="20"/>
               </w:rPr>
-              <w:t>Stewardship Map</w:t>
+              <w:t>Stewardship Map · Diagnose</w:t>
             </w:r>
           </w:p>
         </w:tc>
@@ -349,7 +594,7 @@
                 <w:color w:val="FFFFFF"/>
                 <w:sz w:val="20"/>
               </w:rPr>
-              <w:t>PublicLogic</w:t>
+              <w:t>PublicLogic · Deliver</w:t>
             </w:r>
           </w:p>
         </w:tc>
@@ -372,7 +617,7 @@
     </w:tbl>
     <w:p>
       <w:pPr>
-        <w:spacing w:before="60" w:after="120" w:line="252" w:lineRule="auto"/>
+        <w:spacing w:before="60" w:after="60" w:line="252" w:lineRule="auto"/>
         <w:jc w:val="left"/>
       </w:pPr>
       <w:r>
@@ -384,6 +629,48 @@
           <w:sz w:val="19"/>
         </w:rPr>
         <w:t>Delivered through Continuity &amp; Stewardship Systems — the records, processes, templates, environments, accountability, and proof that help the work survive turnover. It's the plumbing, not a product.</w:t>
+      </w:r>
+    </w:p>
+    <w:p>
+      <w:pPr>
+        <w:spacing w:before="0" w:after="80" w:line="252" w:lineRule="auto"/>
+        <w:jc w:val="left"/>
+      </w:pPr>
+      <w:r>
+        <w:rPr>
+          <w:rFonts w:ascii="Calibri" w:hAnsi="Calibri"/>
+          <w:b w:val="0"/>
+          <w:i/>
+          <w:color w:val="6B6660"/>
+          <w:sz w:val="19"/>
+        </w:rPr>
+        <w:t>What we're becoming:  LogicCommons = public infrastructure · Permit &amp; Bridge = navigation infrastructure · PublicLogic = professional services · Continuity &amp; Stewardship Systems = delivery infrastructure.</w:t>
+      </w:r>
+    </w:p>
+    <w:p>
+      <w:pPr>
+        <w:spacing w:before="40" w:after="120" w:line="252" w:lineRule="auto"/>
+        <w:jc w:val="left"/>
+      </w:pPr>
+      <w:r>
+        <w:rPr>
+          <w:rFonts w:ascii="Calibri" w:hAnsi="Calibri"/>
+          <w:b/>
+          <w:i w:val="0"/>
+          <w:color w:val="0F4C3A"/>
+          <w:sz w:val="23"/>
+        </w:rPr>
+        <w:t xml:space="preserve">The one-line version:  </w:t>
+      </w:r>
+      <w:r>
+        <w:rPr>
+          <w:rFonts w:ascii="Georgia" w:hAnsi="Georgia"/>
+          <w:b w:val="0"/>
+          <w:i/>
+          <w:color w:val="1A1D20"/>
+          <w:sz w:val="23"/>
+        </w:rPr>
+        <w:t>Help people understand the path. Help projects move through the path. Leave the path easier for the next person.</w:t>
       </w:r>
     </w:p>
     <w:p>

</xml_diff>

<commit_message>
Finalize v1 for launch: consistent price + email, Go-Live checklist, full package
Consistency pass for go-live:
- Permit Path Scan = $500 flat everywhere (docs + site); rush/complex/follow-up
  kept as the run-book ladder.
- Single contact nate@publiclogic.org across site (footer, form, API, start)
  and all docs; ENV_REFERENCE example updated.

New:
- START HERE & Go-Live Checklist doc — package index, what-to-send-whom, the
  go-live steps (domain/email, deploy, wire contact form, E&O gate), and the
  30-day money plan.
- Move Forward "What's in the stack" now lists all current deliverables.

Rebuilt all 14 package docs; workbook formulas validated (0 errors). Web app
typechecks clean and next build prerenders all 15 routes. Public worksheet
download refreshed to the $500 version. Final package = 14 documents.

https://claude.ai/code/session_01NNVRfcBeiW4jRftzrwemzW
</commit_message>
<xml_diff>
--- a/docs/business/final_deck/PublicLogic - Move Forward (v1 Business Stack).docx
+++ b/docs/business/final_deck/PublicLogic - Move Forward (v1 Business Stack).docx
@@ -764,7 +764,40 @@
                 <w:color w:val="1A1D20"/>
                 <w:sz w:val="20"/>
               </w:rPr>
-              <w:t>The operating document. 11 tabs: why we exist, what breaks, what we do, the offer stack, Permit &amp; Bridge, proof, Nathan + Allie, transfer, who we pursue, next 12 months. Internal strategy — start here.</w:t>
+              <w:t>The operating document. 12 tabs (incl. a Language / Do-Not-Say guardrail). Internal strategy — start here.</w:t>
+            </w:r>
+          </w:p>
+        </w:tc>
+      </w:tr>
+      <w:tr>
+        <w:tc>
+          <w:tcPr>
+            <w:tcW w:type="dxa" w:w="3168"/>
+          </w:tcPr>
+          <w:p>
+            <w:r>
+              <w:rPr>
+                <w:rFonts w:ascii="Calibri" w:hAnsi="Calibri"/>
+                <w:b/>
+                <w:color w:val="1A1D20"/>
+                <w:sz w:val="20"/>
+              </w:rPr>
+              <w:t>The Path (one-page visual)</w:t>
+            </w:r>
+          </w:p>
+        </w:tc>
+        <w:tc>
+          <w:tcPr>
+            <w:tcW w:type="dxa" w:w="6768"/>
+          </w:tcPr>
+          <w:p>
+            <w:r>
+              <w:rPr>
+                <w:rFonts w:ascii="Calibri" w:hAnsi="Calibri"/>
+                <w:color w:val="1A1D20"/>
+                <w:sz w:val="20"/>
+              </w:rPr>
+              <w:t>The five-layer / five-verb diagram. Goes everywhere.</w:t>
             </w:r>
           </w:p>
         </w:tc>
@@ -896,7 +929,205 @@
                 <w:color w:val="1A1D20"/>
                 <w:sz w:val="20"/>
               </w:rPr>
-              <w:t>Sellable. $250–$750 triage. The cheap entry that feeds the Map.</w:t>
+              <w:t>Sellable. $500 flat triage. The cheap entry that feeds the Map.</w:t>
+            </w:r>
+          </w:p>
+        </w:tc>
+      </w:tr>
+      <w:tr>
+        <w:tc>
+          <w:tcPr>
+            <w:tcW w:type="dxa" w:w="3168"/>
+          </w:tcPr>
+          <w:p>
+            <w:r>
+              <w:rPr>
+                <w:rFonts w:ascii="Calibri" w:hAnsi="Calibri"/>
+                <w:b/>
+                <w:color w:val="1A1D20"/>
+                <w:sz w:val="20"/>
+              </w:rPr>
+              <w:t>Permit &amp; Bridge Sprint — Scope &amp; Fee Sheet</w:t>
+            </w:r>
+          </w:p>
+        </w:tc>
+        <w:tc>
+          <w:tcPr>
+            <w:tcW w:type="dxa" w:w="6768"/>
+          </w:tcPr>
+          <w:p>
+            <w:r>
+              <w:rPr>
+                <w:rFonts w:ascii="Calibri" w:hAnsi="Calibri"/>
+                <w:color w:val="1A1D20"/>
+                <w:sz w:val="20"/>
+              </w:rPr>
+              <w:t>Sellable. $7,500–$15,000. Six concrete deliverables for a stuck project.</w:t>
+            </w:r>
+          </w:p>
+        </w:tc>
+      </w:tr>
+      <w:tr>
+        <w:tc>
+          <w:tcPr>
+            <w:tcW w:type="dxa" w:w="3168"/>
+          </w:tcPr>
+          <w:p>
+            <w:r>
+              <w:rPr>
+                <w:rFonts w:ascii="Calibri" w:hAnsi="Calibri"/>
+                <w:b/>
+                <w:color w:val="1A1D20"/>
+                <w:sz w:val="20"/>
+              </w:rPr>
+              <w:t>Permit Path Scan — 30-Day Cash Offer (run book)</w:t>
+            </w:r>
+          </w:p>
+        </w:tc>
+        <w:tc>
+          <w:tcPr>
+            <w:tcW w:type="dxa" w:w="6768"/>
+          </w:tcPr>
+          <w:p>
+            <w:r>
+              <w:rPr>
+                <w:rFonts w:ascii="Calibri" w:hAnsi="Calibri"/>
+                <w:color w:val="1A1D20"/>
+                <w:sz w:val="20"/>
+              </w:rPr>
+              <w:t>The wedge to cash this month, ring-fenced under LogicCommons / Permit &amp; Bridge.</w:t>
+            </w:r>
+          </w:p>
+        </w:tc>
+      </w:tr>
+      <w:tr>
+        <w:tc>
+          <w:tcPr>
+            <w:tcW w:type="dxa" w:w="3168"/>
+          </w:tcPr>
+          <w:p>
+            <w:r>
+              <w:rPr>
+                <w:rFonts w:ascii="Calibri" w:hAnsi="Calibri"/>
+                <w:b/>
+                <w:color w:val="1A1D20"/>
+                <w:sz w:val="20"/>
+              </w:rPr>
+              <w:t>LogicCommons — “Can I Do This?” worksheet</w:t>
+            </w:r>
+          </w:p>
+        </w:tc>
+        <w:tc>
+          <w:tcPr>
+            <w:tcW w:type="dxa" w:w="6768"/>
+          </w:tcPr>
+          <w:p>
+            <w:r>
+              <w:rPr>
+                <w:rFonts w:ascii="Calibri" w:hAnsi="Calibri"/>
+                <w:color w:val="1A1D20"/>
+                <w:sz w:val="20"/>
+              </w:rPr>
+              <w:t>The free public artifact. Trust + triage; feeds the Scan.</w:t>
+            </w:r>
+          </w:p>
+        </w:tc>
+      </w:tr>
+      <w:tr>
+        <w:tc>
+          <w:tcPr>
+            <w:tcW w:type="dxa" w:w="3168"/>
+          </w:tcPr>
+          <w:p>
+            <w:r>
+              <w:rPr>
+                <w:rFonts w:ascii="Calibri" w:hAnsi="Calibri"/>
+                <w:b/>
+                <w:color w:val="1A1D20"/>
+                <w:sz w:val="20"/>
+              </w:rPr>
+              <w:t>Five Outreach Emails (Tier 1)</w:t>
+            </w:r>
+          </w:p>
+        </w:tc>
+        <w:tc>
+          <w:tcPr>
+            <w:tcW w:type="dxa" w:w="6768"/>
+          </w:tcPr>
+          <w:p>
+            <w:r>
+              <w:rPr>
+                <w:rFonts w:ascii="Calibri" w:hAnsi="Calibri"/>
+                <w:color w:val="1A1D20"/>
+                <w:sz w:val="20"/>
+              </w:rPr>
+              <w:t>Short, no-hype notes that ask for one conversation.</w:t>
+            </w:r>
+          </w:p>
+        </w:tc>
+      </w:tr>
+      <w:tr>
+        <w:tc>
+          <w:tcPr>
+            <w:tcW w:type="dxa" w:w="3168"/>
+          </w:tcPr>
+          <w:p>
+            <w:r>
+              <w:rPr>
+                <w:rFonts w:ascii="Calibri" w:hAnsi="Calibri"/>
+                <w:b/>
+                <w:color w:val="1A1D20"/>
+                <w:sz w:val="20"/>
+              </w:rPr>
+              <w:t>Proof &amp; Case Example</w:t>
+            </w:r>
+          </w:p>
+        </w:tc>
+        <w:tc>
+          <w:tcPr>
+            <w:tcW w:type="dxa" w:w="6768"/>
+          </w:tcPr>
+          <w:p>
+            <w:r>
+              <w:rPr>
+                <w:rFonts w:ascii="Calibri" w:hAnsi="Calibri"/>
+                <w:color w:val="1A1D20"/>
+                <w:sz w:val="20"/>
+              </w:rPr>
+              <w:t>The proof framework + a fill-in case template that turns each job into a quantified result.</w:t>
+            </w:r>
+          </w:p>
+        </w:tc>
+      </w:tr>
+      <w:tr>
+        <w:tc>
+          <w:tcPr>
+            <w:tcW w:type="dxa" w:w="3168"/>
+          </w:tcPr>
+          <w:p>
+            <w:r>
+              <w:rPr>
+                <w:rFonts w:ascii="Calibri" w:hAnsi="Calibri"/>
+                <w:b/>
+                <w:color w:val="1A1D20"/>
+                <w:sz w:val="20"/>
+              </w:rPr>
+              <w:t>Website Copy (v1 Ecosystem)</w:t>
+            </w:r>
+          </w:p>
+        </w:tc>
+        <w:tc>
+          <w:tcPr>
+            <w:tcW w:type="dxa" w:w="6768"/>
+          </w:tcPr>
+          <w:p>
+            <w:r>
+              <w:rPr>
+                <w:rFonts w:ascii="Calibri" w:hAnsi="Calibri"/>
+                <w:color w:val="1A1D20"/>
+                <w:sz w:val="20"/>
+              </w:rPr>
+              <w:t>Every page, in the canon voice. The live site is built from this.</w:t>
             </w:r>
           </w:p>
         </w:tc>
@@ -1026,7 +1257,7 @@
                 <w:color w:val="1A1D20"/>
                 <w:sz w:val="20"/>
               </w:rPr>
-              <w:t>$250 – $750</w:t>
+              <w:t>$500 flat</w:t>
             </w:r>
           </w:p>
         </w:tc>

</xml_diff>